<commit_message>
checkpoint: preserve current local OmniMath source
</commit_message>
<xml_diff>
--- a/OmniMath Diary.docx
+++ b/OmniMath Diary.docx
@@ -350,6 +350,7 @@
         <w:t xml:space="preserve"> should preserve semantic interaction for that 95%, mark the unsupported region as opaque/noninteractive, and </w:t>
       </w:r>
       <w:proofErr w:type="spellStart"/>
+      <w:proofErr w:type="gramStart"/>
       <w:r>
         <w:rPr>
           <w:sz w:val="20"/>
@@ -359,6 +360,7 @@
         <w:t>continue.That</w:t>
       </w:r>
       <w:proofErr w:type="spellEnd"/>
+      <w:proofErr w:type="gramEnd"/>
       <w:r>
         <w:rPr>
           <w:sz w:val="20"/>
@@ -592,7 +594,10 @@
     <w:p>
       <w:pPr>
         <w:rPr>
-          <w:lang w:val="en-US"/>
+          <w:rFonts w:ascii="Times New Roman" w:eastAsia="Times New Roman" w:hAnsi="Times New Roman" w:cs="Times New Roman"/>
+          <w:sz w:val="24"/>
+          <w:szCs w:val="24"/>
+          <w:lang w:val="en-US" w:eastAsia="ru-RU"/>
         </w:rPr>
       </w:pPr>
       <w:r>
@@ -615,8 +620,535 @@
         </w:rPr>
         <w:t xml:space="preserve"> pointer target state (01a06478-8e88-7533-9e97-ed26615c2562)</w:t>
       </w:r>
+      <w:r>
+        <w:rPr>
+          <w:lang w:val="en-US"/>
+        </w:rPr>
+        <w:br/>
+      </w:r>
+      <w:r>
+        <w:rPr>
+          <w:lang w:val="en-US"/>
+        </w:rPr>
+        <w:br/>
+        <w:t>TALK TO KAPLAN ENTREPENOUR TEAMS</w:t>
+      </w:r>
+      <w:r>
+        <w:rPr>
+          <w:lang w:val="en-US"/>
+        </w:rPr>
+        <w:br/>
+      </w:r>
+      <w:proofErr w:type="spellStart"/>
+      <w:r>
+        <w:rPr>
+          <w:lang w:val="en-US"/>
+        </w:rPr>
+        <w:t>colour</w:t>
+      </w:r>
+      <w:proofErr w:type="spellEnd"/>
+      <w:r>
+        <w:rPr>
+          <w:lang w:val="en-US"/>
+        </w:rPr>
+        <w:t xml:space="preserve"> combinations, potentially green, red stop, blue calm,</w:t>
+      </w:r>
+      <w:r>
+        <w:rPr>
+          <w:lang w:val="en-US"/>
+        </w:rPr>
+        <w:br/>
+      </w:r>
+      <w:r>
+        <w:rPr>
+          <w:lang w:val="en-US"/>
+        </w:rPr>
+        <w:br/>
+      </w:r>
+      <w:r>
+        <w:rPr>
+          <w:rFonts w:ascii="Times New Roman" w:eastAsia="Times New Roman" w:hAnsi="Symbol" w:cs="Times New Roman"/>
+          <w:sz w:val="24"/>
+          <w:szCs w:val="24"/>
+          <w:lang w:eastAsia="ru-RU"/>
+        </w:rPr>
+        <w:t></w:t>
+      </w:r>
+      <w:r>
+        <w:rPr>
+          <w:rFonts w:ascii="Times New Roman" w:eastAsia="Times New Roman" w:hAnsi="Times New Roman" w:cs="Times New Roman"/>
+          <w:sz w:val="24"/>
+          <w:szCs w:val="24"/>
+          <w:lang w:val="en-US" w:eastAsia="ru-RU"/>
+        </w:rPr>
+        <w:t xml:space="preserve">  Luna twice generated </w:t>
+      </w:r>
+      <w:r>
+        <w:rPr>
+          <w:rFonts w:ascii="Times New Roman" w:eastAsia="Times New Roman" w:hAnsi="Times New Roman" w:cs="Times New Roman"/>
+          <w:b/>
+          <w:bCs/>
+          <w:sz w:val="24"/>
+          <w:szCs w:val="24"/>
+          <w:lang w:val="en-US" w:eastAsia="ru-RU"/>
+        </w:rPr>
+        <w:t xml:space="preserve">valid JSON containing invalid </w:t>
+      </w:r>
+      <w:proofErr w:type="spellStart"/>
+      <w:r>
+        <w:rPr>
+          <w:rFonts w:ascii="Times New Roman" w:eastAsia="Times New Roman" w:hAnsi="Times New Roman" w:cs="Times New Roman"/>
+          <w:b/>
+          <w:bCs/>
+          <w:sz w:val="24"/>
+          <w:szCs w:val="24"/>
+          <w:lang w:val="en-US" w:eastAsia="ru-RU"/>
+        </w:rPr>
+        <w:t>KaTeX</w:t>
+      </w:r>
+      <w:proofErr w:type="spellEnd"/>
+      <w:r>
+        <w:rPr>
+          <w:rFonts w:ascii="Times New Roman" w:eastAsia="Times New Roman" w:hAnsi="Times New Roman" w:cs="Times New Roman"/>
+          <w:sz w:val="24"/>
+          <w:szCs w:val="24"/>
+          <w:lang w:val="en-US" w:eastAsia="ru-RU"/>
+        </w:rPr>
+        <w:t xml:space="preserve">, so </w:t>
+      </w:r>
+      <w:proofErr w:type="spellStart"/>
+      <w:r>
+        <w:rPr>
+          <w:rFonts w:ascii="Times New Roman" w:eastAsia="Times New Roman" w:hAnsi="Times New Roman" w:cs="Times New Roman"/>
+          <w:sz w:val="24"/>
+          <w:szCs w:val="24"/>
+          <w:lang w:val="en-US" w:eastAsia="ru-RU"/>
+        </w:rPr>
+        <w:t>OmniMath’s</w:t>
+      </w:r>
+      <w:proofErr w:type="spellEnd"/>
+      <w:r>
+        <w:rPr>
+          <w:rFonts w:ascii="Times New Roman" w:eastAsia="Times New Roman" w:hAnsi="Times New Roman" w:cs="Times New Roman"/>
+          <w:sz w:val="24"/>
+          <w:szCs w:val="24"/>
+          <w:lang w:val="en-US" w:eastAsia="ru-RU"/>
+        </w:rPr>
+        <w:t xml:space="preserve"> validator rejected the entire solution instead of recovering the broken math field. </w:t>
+      </w:r>
+    </w:p>
+    <w:p>
+      <w:pPr>
+        <w:spacing w:after="0" w:line="240" w:lineRule="auto"/>
+        <w:rPr>
+          <w:rFonts w:ascii="Times New Roman" w:eastAsia="Times New Roman" w:hAnsi="Times New Roman" w:cs="Times New Roman"/>
+          <w:sz w:val="24"/>
+          <w:szCs w:val="24"/>
+          <w:lang w:val="en-US" w:eastAsia="ru-RU"/>
+        </w:rPr>
+      </w:pPr>
+      <w:r>
+        <w:rPr>
+          <w:rFonts w:ascii="Times New Roman" w:eastAsia="Times New Roman" w:hAnsi="Symbol" w:cs="Times New Roman"/>
+          <w:sz w:val="24"/>
+          <w:szCs w:val="24"/>
+          <w:lang w:eastAsia="ru-RU"/>
+        </w:rPr>
+        <w:t></w:t>
+      </w:r>
+      <w:r>
+        <w:rPr>
+          <w:rFonts w:ascii="Times New Roman" w:eastAsia="Times New Roman" w:hAnsi="Times New Roman" w:cs="Times New Roman"/>
+          <w:sz w:val="24"/>
+          <w:szCs w:val="24"/>
+          <w:lang w:val="en-US" w:eastAsia="ru-RU"/>
+        </w:rPr>
+        <w:t xml:space="preserve">  On another attempt, Luna generated </w:t>
+      </w:r>
+      <w:r>
+        <w:rPr>
+          <w:rFonts w:ascii="Times New Roman" w:eastAsia="Times New Roman" w:hAnsi="Times New Roman" w:cs="Times New Roman"/>
+          <w:b/>
+          <w:bCs/>
+          <w:sz w:val="24"/>
+          <w:szCs w:val="24"/>
+          <w:lang w:val="en-US" w:eastAsia="ru-RU"/>
+        </w:rPr>
+        <w:t xml:space="preserve">valid, </w:t>
+      </w:r>
+      <w:proofErr w:type="spellStart"/>
+      <w:r>
+        <w:rPr>
+          <w:rFonts w:ascii="Times New Roman" w:eastAsia="Times New Roman" w:hAnsi="Times New Roman" w:cs="Times New Roman"/>
+          <w:b/>
+          <w:bCs/>
+          <w:sz w:val="24"/>
+          <w:szCs w:val="24"/>
+          <w:lang w:val="en-US" w:eastAsia="ru-RU"/>
+        </w:rPr>
+        <w:t>renderable</w:t>
+      </w:r>
+      <w:proofErr w:type="spellEnd"/>
+      <w:r>
+        <w:rPr>
+          <w:rFonts w:ascii="Times New Roman" w:eastAsia="Times New Roman" w:hAnsi="Times New Roman" w:cs="Times New Roman"/>
+          <w:b/>
+          <w:bCs/>
+          <w:sz w:val="24"/>
+          <w:szCs w:val="24"/>
+          <w:lang w:val="en-US" w:eastAsia="ru-RU"/>
+        </w:rPr>
+        <w:t xml:space="preserve"> </w:t>
+      </w:r>
+      <w:proofErr w:type="spellStart"/>
+      <w:r>
+        <w:rPr>
+          <w:rFonts w:ascii="Times New Roman" w:eastAsia="Times New Roman" w:hAnsi="Times New Roman" w:cs="Times New Roman"/>
+          <w:b/>
+          <w:bCs/>
+          <w:sz w:val="24"/>
+          <w:szCs w:val="24"/>
+          <w:lang w:val="en-US" w:eastAsia="ru-RU"/>
+        </w:rPr>
+        <w:t>KaTeX</w:t>
+      </w:r>
+      <w:proofErr w:type="spellEnd"/>
+      <w:r>
+        <w:rPr>
+          <w:rFonts w:ascii="Times New Roman" w:eastAsia="Times New Roman" w:hAnsi="Times New Roman" w:cs="Times New Roman"/>
+          <w:b/>
+          <w:bCs/>
+          <w:sz w:val="24"/>
+          <w:szCs w:val="24"/>
+          <w:lang w:val="en-US" w:eastAsia="ru-RU"/>
+        </w:rPr>
+        <w:t xml:space="preserve"> but incorrect mathematics</w:t>
+      </w:r>
+      <w:r>
+        <w:rPr>
+          <w:rFonts w:ascii="Times New Roman" w:eastAsia="Times New Roman" w:hAnsi="Times New Roman" w:cs="Times New Roman"/>
+          <w:sz w:val="24"/>
+          <w:szCs w:val="24"/>
+          <w:lang w:val="en-US" w:eastAsia="ru-RU"/>
+        </w:rPr>
+        <w:t xml:space="preserve">, making a Taylor-expansion error that led to the wrong final answer. </w:t>
+      </w:r>
+    </w:p>
+    <w:p>
+      <w:pPr>
+        <w:spacing w:after="0" w:line="240" w:lineRule="auto"/>
+        <w:rPr>
+          <w:rFonts w:ascii="Times New Roman" w:eastAsia="Times New Roman" w:hAnsi="Times New Roman" w:cs="Times New Roman"/>
+          <w:sz w:val="24"/>
+          <w:szCs w:val="24"/>
+          <w:lang w:val="en-US" w:eastAsia="ru-RU"/>
+        </w:rPr>
+      </w:pPr>
+      <w:r>
+        <w:rPr>
+          <w:rFonts w:ascii="Times New Roman" w:eastAsia="Times New Roman" w:hAnsi="Symbol" w:cs="Times New Roman"/>
+          <w:sz w:val="24"/>
+          <w:szCs w:val="24"/>
+          <w:lang w:eastAsia="ru-RU"/>
+        </w:rPr>
+        <w:t></w:t>
+      </w:r>
+      <w:r>
+        <w:rPr>
+          <w:rFonts w:ascii="Times New Roman" w:eastAsia="Times New Roman" w:hAnsi="Times New Roman" w:cs="Times New Roman"/>
+          <w:sz w:val="24"/>
+          <w:szCs w:val="24"/>
+          <w:lang w:val="en-US" w:eastAsia="ru-RU"/>
+        </w:rPr>
+        <w:t xml:space="preserve">  The first failure was </w:t>
+      </w:r>
+      <w:r>
+        <w:rPr>
+          <w:rFonts w:ascii="Times New Roman" w:eastAsia="Times New Roman" w:hAnsi="Times New Roman" w:cs="Times New Roman"/>
+          <w:b/>
+          <w:bCs/>
+          <w:sz w:val="24"/>
+          <w:szCs w:val="24"/>
+          <w:lang w:val="en-US" w:eastAsia="ru-RU"/>
+        </w:rPr>
+        <w:t>fail-closed</w:t>
+      </w:r>
+      <w:r>
+        <w:rPr>
+          <w:rFonts w:ascii="Times New Roman" w:eastAsia="Times New Roman" w:hAnsi="Times New Roman" w:cs="Times New Roman"/>
+          <w:sz w:val="24"/>
+          <w:szCs w:val="24"/>
+          <w:lang w:val="en-US" w:eastAsia="ru-RU"/>
+        </w:rPr>
+        <w:t xml:space="preserve">: bad formatting was caught and nothing was shown. </w:t>
+      </w:r>
+    </w:p>
+    <w:p>
+      <w:pPr>
+        <w:spacing w:after="0" w:line="240" w:lineRule="auto"/>
+        <w:rPr>
+          <w:rFonts w:ascii="Times New Roman" w:eastAsia="Times New Roman" w:hAnsi="Times New Roman" w:cs="Times New Roman"/>
+          <w:sz w:val="24"/>
+          <w:szCs w:val="24"/>
+          <w:lang w:val="en-US" w:eastAsia="ru-RU"/>
+        </w:rPr>
+      </w:pPr>
+      <w:r>
+        <w:rPr>
+          <w:rFonts w:ascii="Times New Roman" w:eastAsia="Times New Roman" w:hAnsi="Symbol" w:cs="Times New Roman"/>
+          <w:sz w:val="24"/>
+          <w:szCs w:val="24"/>
+          <w:lang w:eastAsia="ru-RU"/>
+        </w:rPr>
+        <w:t></w:t>
+      </w:r>
+      <w:r>
+        <w:rPr>
+          <w:rFonts w:ascii="Times New Roman" w:eastAsia="Times New Roman" w:hAnsi="Times New Roman" w:cs="Times New Roman"/>
+          <w:sz w:val="24"/>
+          <w:szCs w:val="24"/>
+          <w:lang w:val="en-US" w:eastAsia="ru-RU"/>
+        </w:rPr>
+        <w:t xml:space="preserve">  The second was </w:t>
+      </w:r>
+      <w:r>
+        <w:rPr>
+          <w:rFonts w:ascii="Times New Roman" w:eastAsia="Times New Roman" w:hAnsi="Times New Roman" w:cs="Times New Roman"/>
+          <w:b/>
+          <w:bCs/>
+          <w:sz w:val="24"/>
+          <w:szCs w:val="24"/>
+          <w:lang w:val="en-US" w:eastAsia="ru-RU"/>
+        </w:rPr>
+        <w:t>fail-open</w:t>
+      </w:r>
+      <w:r>
+        <w:rPr>
+          <w:rFonts w:ascii="Times New Roman" w:eastAsia="Times New Roman" w:hAnsi="Times New Roman" w:cs="Times New Roman"/>
+          <w:sz w:val="24"/>
+          <w:szCs w:val="24"/>
+          <w:lang w:val="en-US" w:eastAsia="ru-RU"/>
+        </w:rPr>
+        <w:t xml:space="preserve">: structurally valid but mathematically wrong reasoning reached the user. </w:t>
+      </w:r>
+    </w:p>
+    <w:p>
+      <w:pPr>
+        <w:rPr>
+          <w:rFonts w:ascii="Times New Roman" w:eastAsia="Times New Roman" w:hAnsi="Times New Roman" w:cs="Times New Roman"/>
+          <w:sz w:val="24"/>
+          <w:szCs w:val="24"/>
+          <w:lang w:val="en-US" w:eastAsia="ru-RU"/>
+        </w:rPr>
+      </w:pPr>
+      <w:r>
+        <w:rPr>
+          <w:rFonts w:ascii="Times New Roman" w:eastAsia="Times New Roman" w:hAnsi="Symbol" w:cs="Times New Roman"/>
+          <w:sz w:val="24"/>
+          <w:szCs w:val="24"/>
+          <w:lang w:eastAsia="ru-RU"/>
+        </w:rPr>
+        <w:t></w:t>
+      </w:r>
+      <w:r>
+        <w:rPr>
+          <w:rFonts w:ascii="Times New Roman" w:eastAsia="Times New Roman" w:hAnsi="Times New Roman" w:cs="Times New Roman"/>
+          <w:sz w:val="24"/>
+          <w:szCs w:val="24"/>
+          <w:lang w:val="en-US" w:eastAsia="ru-RU"/>
+        </w:rPr>
+        <w:t xml:space="preserve">  Together, they show </w:t>
+      </w:r>
+      <w:proofErr w:type="spellStart"/>
+      <w:r>
+        <w:rPr>
+          <w:rFonts w:ascii="Times New Roman" w:eastAsia="Times New Roman" w:hAnsi="Times New Roman" w:cs="Times New Roman"/>
+          <w:sz w:val="24"/>
+          <w:szCs w:val="24"/>
+          <w:lang w:val="en-US" w:eastAsia="ru-RU"/>
+        </w:rPr>
+        <w:t>OmniMath</w:t>
+      </w:r>
+      <w:proofErr w:type="spellEnd"/>
+      <w:r>
+        <w:rPr>
+          <w:rFonts w:ascii="Times New Roman" w:eastAsia="Times New Roman" w:hAnsi="Times New Roman" w:cs="Times New Roman"/>
+          <w:sz w:val="24"/>
+          <w:szCs w:val="24"/>
+          <w:lang w:val="en-US" w:eastAsia="ru-RU"/>
+        </w:rPr>
+        <w:t xml:space="preserve"> needs both </w:t>
+      </w:r>
+      <w:r>
+        <w:rPr>
+          <w:rFonts w:ascii="Times New Roman" w:eastAsia="Times New Roman" w:hAnsi="Times New Roman" w:cs="Times New Roman"/>
+          <w:b/>
+          <w:bCs/>
+          <w:sz w:val="24"/>
+          <w:szCs w:val="24"/>
+          <w:lang w:val="en-US" w:eastAsia="ru-RU"/>
+        </w:rPr>
+        <w:t>localized output recovery</w:t>
+      </w:r>
+      <w:r>
+        <w:rPr>
+          <w:rFonts w:ascii="Times New Roman" w:eastAsia="Times New Roman" w:hAnsi="Times New Roman" w:cs="Times New Roman"/>
+          <w:sz w:val="24"/>
+          <w:szCs w:val="24"/>
+          <w:lang w:val="en-US" w:eastAsia="ru-RU"/>
+        </w:rPr>
+        <w:t xml:space="preserve"> and </w:t>
+      </w:r>
+      <w:r>
+        <w:rPr>
+          <w:rFonts w:ascii="Times New Roman" w:eastAsia="Times New Roman" w:hAnsi="Times New Roman" w:cs="Times New Roman"/>
+          <w:b/>
+          <w:bCs/>
+          <w:sz w:val="24"/>
+          <w:szCs w:val="24"/>
+          <w:lang w:val="en-US" w:eastAsia="ru-RU"/>
+        </w:rPr>
+        <w:t>mathematical correctness verification</w:t>
+      </w:r>
+      <w:r>
+        <w:rPr>
+          <w:rFonts w:ascii="Times New Roman" w:eastAsia="Times New Roman" w:hAnsi="Times New Roman" w:cs="Times New Roman"/>
+          <w:sz w:val="24"/>
+          <w:szCs w:val="24"/>
+          <w:lang w:val="en-US" w:eastAsia="ru-RU"/>
+        </w:rPr>
+        <w:t>.</w:t>
+      </w:r>
+    </w:p>
+    <w:p>
+      <w:pPr>
+        <w:rPr>
+          <w:rFonts w:ascii="Times New Roman" w:eastAsia="Times New Roman" w:hAnsi="Times New Roman" w:cs="Times New Roman"/>
+          <w:sz w:val="24"/>
+          <w:szCs w:val="24"/>
+          <w:lang w:val="en-US" w:eastAsia="ru-RU"/>
+        </w:rPr>
+      </w:pPr>
+      <w:r>
+        <w:rPr>
+          <w:rFonts w:ascii="Times New Roman" w:eastAsia="Times New Roman" w:hAnsi="Times New Roman" w:cs="Times New Roman"/>
+          <w:sz w:val="24"/>
+          <w:szCs w:val="24"/>
+          <w:lang w:val="en-US" w:eastAsia="ru-RU"/>
+        </w:rPr>
+        <w:br/>
+      </w:r>
+      <w:r>
+        <w:rPr>
+          <w:rFonts w:ascii="Times New Roman" w:eastAsia="Times New Roman" w:hAnsi="Times New Roman" w:cs="Times New Roman"/>
+          <w:sz w:val="24"/>
+          <w:szCs w:val="24"/>
+          <w:lang w:val="en-US" w:eastAsia="ru-RU"/>
+        </w:rPr>
+        <w:br/>
+      </w:r>
       <w:bookmarkStart w:id="0" w:name="_GoBack"/>
+      <w:r>
+        <w:rPr>
+          <w:rFonts w:ascii="Times New Roman" w:eastAsia="Times New Roman" w:hAnsi="Times New Roman" w:cs="Times New Roman"/>
+          <w:b/>
+          <w:bCs/>
+          <w:sz w:val="24"/>
+          <w:szCs w:val="24"/>
+          <w:lang w:val="en-US" w:eastAsia="ru-RU"/>
+        </w:rPr>
+        <w:t>Physics and mathematical problems together, predominantly Master’s problems</w:t>
+      </w:r>
+      <w:r>
+        <w:rPr>
+          <w:rFonts w:ascii="Times New Roman" w:eastAsia="Times New Roman" w:hAnsi="Times New Roman" w:cs="Times New Roman"/>
+          <w:sz w:val="24"/>
+          <w:szCs w:val="24"/>
+          <w:lang w:val="en-US" w:eastAsia="ru-RU"/>
+        </w:rPr>
+        <w:t xml:space="preserve">, for example </w:t>
+      </w:r>
+      <w:proofErr w:type="spellStart"/>
+      <w:r>
+        <w:rPr>
+          <w:rFonts w:ascii="Times New Roman" w:eastAsia="Times New Roman" w:hAnsi="Times New Roman" w:cs="Times New Roman"/>
+          <w:sz w:val="24"/>
+          <w:szCs w:val="24"/>
+          <w:lang w:val="en-US" w:eastAsia="ru-RU"/>
+        </w:rPr>
+        <w:t>quasai</w:t>
+      </w:r>
+      <w:proofErr w:type="spellEnd"/>
+      <w:r>
+        <w:rPr>
+          <w:rFonts w:ascii="Times New Roman" w:eastAsia="Times New Roman" w:hAnsi="Times New Roman" w:cs="Times New Roman"/>
+          <w:sz w:val="24"/>
+          <w:szCs w:val="24"/>
+          <w:lang w:val="en-US" w:eastAsia="ru-RU"/>
+        </w:rPr>
+        <w:t xml:space="preserve"> newton equations. Even thermodynamics, </w:t>
+      </w:r>
+      <w:r>
+        <w:rPr>
+          <w:rFonts w:ascii="Times New Roman" w:eastAsia="Times New Roman" w:hAnsi="Times New Roman" w:cs="Times New Roman"/>
+          <w:sz w:val="24"/>
+          <w:szCs w:val="24"/>
+          <w:lang w:val="en-US" w:eastAsia="ru-RU"/>
+        </w:rPr>
+        <w:br/>
+      </w:r>
       <w:bookmarkEnd w:id="0"/>
+      <w:r>
+        <w:rPr>
+          <w:rFonts w:ascii="Times New Roman" w:eastAsia="Times New Roman" w:hAnsi="Times New Roman" w:cs="Times New Roman"/>
+          <w:sz w:val="24"/>
+          <w:szCs w:val="24"/>
+          <w:lang w:val="en-US" w:eastAsia="ru-RU"/>
+        </w:rPr>
+        <w:t xml:space="preserve"> </w:t>
+      </w:r>
+      <w:r>
+        <w:rPr>
+          <w:rFonts w:ascii="Times New Roman" w:eastAsia="Times New Roman" w:hAnsi="Times New Roman" w:cs="Times New Roman"/>
+          <w:sz w:val="24"/>
+          <w:szCs w:val="24"/>
+          <w:lang w:val="en-US" w:eastAsia="ru-RU"/>
+        </w:rPr>
+        <w:br/>
+        <w:t>A small button allowing the addition of symbols next to the prompt bar.</w:t>
+      </w:r>
+      <w:r>
+        <w:rPr>
+          <w:rFonts w:ascii="Times New Roman" w:eastAsia="Times New Roman" w:hAnsi="Times New Roman" w:cs="Times New Roman"/>
+          <w:sz w:val="24"/>
+          <w:szCs w:val="24"/>
+          <w:lang w:val="en-US" w:eastAsia="ru-RU"/>
+        </w:rPr>
+        <w:br/>
+      </w:r>
+      <w:r>
+        <w:rPr>
+          <w:rFonts w:ascii="Times New Roman" w:eastAsia="Times New Roman" w:hAnsi="Times New Roman" w:cs="Times New Roman"/>
+          <w:sz w:val="24"/>
+          <w:szCs w:val="24"/>
+          <w:lang w:val="en-US" w:eastAsia="ru-RU"/>
+        </w:rPr>
+        <w:br/>
+      </w:r>
+    </w:p>
+    <w:p>
+      <w:pPr>
+        <w:rPr>
+          <w:lang w:val="en-US"/>
+        </w:rPr>
+      </w:pPr>
+      <w:r>
+        <w:rPr>
+          <w:lang w:val="en-US"/>
+        </w:rPr>
+        <w:lastRenderedPageBreak/>
+        <w:br/>
+      </w:r>
     </w:p>
     <w:sectPr>
       <w:pgSz w:w="11906" w:h="16838" w:code="9"/>

</xml_diff>